<commit_message>
feat: replace self-check questions with 10-question self-assessment tests across lectures
- Added structured tests to various lectures for self-evaluation or Google Classroom publication.
- Standardized format: 10 multiple-choice questions with one correct answer each.
- Removed existing self-check sections to streamline content consistency.
- Updated lab criteria documents as part of alignment with the assessment structure.
</commit_message>
<xml_diff>
--- a/public/labs/pmzi/Критерії_оцінювання_ПМЗІ.docx
+++ b/public/labs/pmzi/Критерії_оцінювання_ПМЗІ.docx
@@ -493,6 +493,167 @@
       </w:r>
     </w:p>
     <w:bookmarkEnd w:id="11"/>
+    <w:bookmarkStart w:id="12" w:name="оцінювання-тесту-самостійної-роботи"/>
+    <w:p>
+      <w:pPr>
+        <w:pStyle w:val="Heading2"/>
+      </w:pPr>
+      <w:r>
+        <w:t xml:space="preserve">Оцінювання тесту самостійної роботи</w:t>
+      </w:r>
+    </w:p>
+    <w:p>
+      <w:pPr>
+        <w:pStyle w:val="FirstParagraph"/>
+      </w:pPr>
+      <w:r>
+        <w:t xml:space="preserve">Тема, винесена на самостійне опрацювання, перевіряється тестом у Google Classroom: десять запитань, по одному балу за кожне. Оцінка виставляється за кількістю правильних відповідей.</w:t>
+      </w:r>
+    </w:p>
+    <w:tbl>
+      <w:tblPr>
+        <w:tblStyle w:val="Table"/>
+        <w:tblW w:type="dxa" w:w="9637"/>
+        <w:tblLook w:firstRow="1" w:lastRow="0" w:firstColumn="0" w:lastColumn="0" w:noHBand="0" w:noVBand="0" w:val="0020"/>
+        <w:tblLayout w:type="fixed"/>
+      </w:tblPr>
+      <w:tblGrid>
+        <w:gridCol w:w="4819"/>
+        <w:gridCol w:w="4818"/>
+      </w:tblGrid>
+      <w:tr>
+        <w:trPr>
+          <w:tblHeader w:val="on"/>
+        </w:trPr>
+        <w:tc>
+          <w:tcPr/>
+          <w:p>
+            <w:pPr>
+              <w:pStyle w:val="Compact"/>
+            </w:pPr>
+            <w:r>
+              <w:t xml:space="preserve">Правильних відповідей</w:t>
+            </w:r>
+          </w:p>
+        </w:tc>
+        <w:tc>
+          <w:tcPr/>
+          <w:p>
+            <w:pPr>
+              <w:pStyle w:val="Compact"/>
+            </w:pPr>
+            <w:r>
+              <w:t xml:space="preserve">Оцінка</w:t>
+            </w:r>
+          </w:p>
+        </w:tc>
+      </w:tr>
+      <w:tr>
+        <w:tc>
+          <w:tcPr/>
+          <w:p>
+            <w:pPr>
+              <w:pStyle w:val="Compact"/>
+            </w:pPr>
+            <w:r>
+              <w:t xml:space="preserve">10-9</w:t>
+            </w:r>
+          </w:p>
+        </w:tc>
+        <w:tc>
+          <w:tcPr/>
+          <w:p>
+            <w:pPr>
+              <w:pStyle w:val="Compact"/>
+            </w:pPr>
+            <w:r>
+              <w:t xml:space="preserve">5 (відмінно)</w:t>
+            </w:r>
+          </w:p>
+        </w:tc>
+      </w:tr>
+      <w:tr>
+        <w:tc>
+          <w:tcPr/>
+          <w:p>
+            <w:pPr>
+              <w:pStyle w:val="Compact"/>
+            </w:pPr>
+            <w:r>
+              <w:t xml:space="preserve">8-7</w:t>
+            </w:r>
+          </w:p>
+        </w:tc>
+        <w:tc>
+          <w:tcPr/>
+          <w:p>
+            <w:pPr>
+              <w:pStyle w:val="Compact"/>
+            </w:pPr>
+            <w:r>
+              <w:t xml:space="preserve">4 (добре)</w:t>
+            </w:r>
+          </w:p>
+        </w:tc>
+      </w:tr>
+      <w:tr>
+        <w:tc>
+          <w:tcPr/>
+          <w:p>
+            <w:pPr>
+              <w:pStyle w:val="Compact"/>
+            </w:pPr>
+            <w:r>
+              <w:t xml:space="preserve">6-5</w:t>
+            </w:r>
+          </w:p>
+        </w:tc>
+        <w:tc>
+          <w:tcPr/>
+          <w:p>
+            <w:pPr>
+              <w:pStyle w:val="Compact"/>
+            </w:pPr>
+            <w:r>
+              <w:t xml:space="preserve">3 (задовільно)</w:t>
+            </w:r>
+          </w:p>
+        </w:tc>
+      </w:tr>
+      <w:tr>
+        <w:tc>
+          <w:tcPr/>
+          <w:p>
+            <w:pPr>
+              <w:pStyle w:val="Compact"/>
+            </w:pPr>
+            <w:r>
+              <w:t xml:space="preserve">4 і менше</w:t>
+            </w:r>
+          </w:p>
+        </w:tc>
+        <w:tc>
+          <w:tcPr/>
+          <w:p>
+            <w:pPr>
+              <w:pStyle w:val="Compact"/>
+            </w:pPr>
+            <w:r>
+              <w:t xml:space="preserve">робота не зарахована</w:t>
+            </w:r>
+          </w:p>
+        </w:tc>
+      </w:tr>
+    </w:tbl>
+    <w:p>
+      <w:pPr>
+        <w:pStyle w:val="BodyText"/>
+      </w:pPr>
+      <w:r>
+        <w:t xml:space="preserve">Тест складається після опрацювання матеріалу теми й до терміну здачі, зазначеного в завданні. Перескладання — за домовленістю з викладачем.</w:t>
+      </w:r>
+    </w:p>
+    <w:bookmarkEnd w:id="12"/>
     <w:sectPr>
       <w:pgSz w:h="16838" w:orient="portrait" w:w="11906"/>
       <w:pgMar w:bottom="1134" w:footer="708" w:gutter="0" w:header="708" w:left="1418" w:right="851" w:top="1134"/>

</xml_diff>